<commit_message>
Configurações para deploy no render
</commit_message>
<xml_diff>
--- a/MVP/app/uploads_temp/comprovante_retirada_2.docx
+++ b/MVP/app/uploads_temp/comprovante_retirada_2.docx
@@ -17,7 +17,7 @@
     </w:p>
     <w:p>
       <w:r>
-        <w:t>Data do Evento: 02-07-2025</w:t>
+        <w:t>Data do Evento: 2025-07-02</w:t>
       </w:r>
     </w:p>
     <w:p>
@@ -27,7 +27,7 @@
     </w:p>
     <w:p>
       <w:r>
-        <w:t>Data de Emissão: 28/09/2025</w:t>
+        <w:t>Data de Emissão: 14/11/2025</w:t>
       </w:r>
     </w:p>
     <w:p>

</xml_diff>